<commit_message>
Minor aesthetic improvements, better metadata (version, ...)
</commit_message>
<xml_diff>
--- a/MSWord/JACoW_MSWord_Style_Guide.docx
+++ b/MSWord/JACoW_MSWord_Style_Guide.docx
@@ -24,9 +24,8 @@
         <w:rPr>
           <w:lang w:val="en-GB"/>
         </w:rPr>
-        <w:t>I. Andrian</w:t>
-      </w:r>
-      <w:bookmarkStart w:id="0" w:name="_Hlk182214859"/>
+        <w:t>J. Chrin</w:t>
+      </w:r>
       <w:r>
         <w:rPr>
           <w:vertAlign w:val="superscript"/>
@@ -34,163 +33,171 @@
         </w:rPr>
         <w:t>1</w:t>
       </w:r>
-      <w:bookmarkEnd w:id="0"/>
-      <w:r>
-        <w:rPr>
-          <w:lang w:val="en-GB"/>
-        </w:rPr>
-        <w:t xml:space="preserve">, </w:t>
-      </w:r>
-      <w:r>
-        <w:rPr>
-          <w:lang w:val="en-GB"/>
-        </w:rPr>
-        <w:t>S. Brown Gibbs</w:t>
-      </w:r>
       <w:r>
         <w:rPr>
           <w:vertAlign w:val="superscript"/>
           <w:lang w:val="en-GB"/>
         </w:rPr>
-        <w:t>2</w:t>
+        <w:t>,†</w:t>
       </w:r>
       <w:r>
         <w:rPr>
           <w:lang w:val="en-GB"/>
         </w:rPr>
-        <w:t>, J</w:t>
+        <w:t xml:space="preserve">, </w:t>
       </w:r>
       <w:r>
         <w:rPr>
           <w:lang w:val="en-GB"/>
         </w:rPr>
-        <w:t>. Chrin</w:t>
+        <w:t>I. Andrian</w:t>
       </w:r>
       <w:r>
         <w:rPr>
           <w:vertAlign w:val="superscript"/>
           <w:lang w:val="en-GB"/>
         </w:rPr>
-        <w:t>3</w:t>
+        <w:t>2</w:t>
+      </w:r>
+      <w:r>
+        <w:rPr>
+          <w:lang w:val="en-GB"/>
+        </w:rPr>
+        <w:t xml:space="preserve">, </w:t>
+      </w:r>
+      <w:r>
+        <w:rPr>
+          <w:lang w:val="en-GB"/>
+        </w:rPr>
+        <w:t>S. Brown Gibbs</w:t>
       </w:r>
       <w:r>
         <w:rPr>
           <w:vertAlign w:val="superscript"/>
           <w:lang w:val="en-GB"/>
         </w:rPr>
-        <w:t>,</w:t>
+        <w:t>3</w:t>
+      </w:r>
+      <w:r>
+        <w:rPr>
+          <w:lang w:val="en-GB"/>
+        </w:rPr>
+        <w:t xml:space="preserve">, </w:t>
+      </w:r>
+      <w:r>
+        <w:rPr>
+          <w:lang w:val="en-GB"/>
+        </w:rPr>
+        <w:t>V. W. R. Schaa</w:t>
       </w:r>
       <w:r>
         <w:rPr>
           <w:vertAlign w:val="superscript"/>
           <w:lang w:val="en-GB"/>
         </w:rPr>
-        <w:t>†</w:t>
-      </w:r>
-      <w:r>
-        <w:rPr>
-          <w:lang w:val="en-GB"/>
-        </w:rPr>
-        <w:t xml:space="preserve">, </w:t>
-      </w:r>
-      <w:r>
-        <w:rPr>
-          <w:lang w:val="en-GB"/>
-        </w:rPr>
-        <w:t>V. W. R. Schaa</w:t>
-      </w:r>
+        <w:t>4</w:t>
+      </w:r>
+      <w:bookmarkStart w:id="0" w:name="_Hlk182219236"/>
       <w:r>
         <w:rPr>
           <w:vertAlign w:val="superscript"/>
           <w:lang w:val="en-GB"/>
         </w:rPr>
-        <w:t>4</w:t>
-      </w:r>
-      <w:bookmarkStart w:id="1" w:name="_Hlk182219236"/>
+        <w:br w:type="textWrapping" w:clear="all"/>
+      </w:r>
       <w:r>
         <w:rPr>
           <w:vertAlign w:val="superscript"/>
           <w:lang w:val="en-GB"/>
         </w:rPr>
-        <w:br w:type="textWrapping" w:clear="all"/>
+        <w:t>1</w:t>
+      </w:r>
+      <w:r>
+        <w:rPr>
+          <w:lang w:val="en-GB"/>
+        </w:rPr>
+        <w:t xml:space="preserve">PSI </w:t>
+      </w:r>
+      <w:proofErr w:type="spellStart"/>
+      <w:r>
+        <w:rPr>
+          <w:lang w:val="en-GB"/>
+        </w:rPr>
+        <w:t>Center</w:t>
+      </w:r>
+      <w:proofErr w:type="spellEnd"/>
+      <w:r>
+        <w:rPr>
+          <w:lang w:val="en-GB"/>
+        </w:rPr>
+        <w:t xml:space="preserve"> for Accelerator Science and Engineering, Villigen, Switzerland</w:t>
       </w:r>
       <w:r>
         <w:rPr>
           <w:vertAlign w:val="superscript"/>
           <w:lang w:val="en-GB"/>
         </w:rPr>
-        <w:t>1</w:t>
-      </w:r>
-      <w:r>
-        <w:rPr>
-          <w:lang w:val="en-GB"/>
-        </w:rPr>
-        <w:t xml:space="preserve">Elettra </w:t>
-      </w:r>
-      <w:proofErr w:type="spellStart"/>
-      <w:r>
-        <w:rPr>
-          <w:lang w:val="en-GB"/>
-        </w:rPr>
-        <w:t>Sincrotrone</w:t>
-      </w:r>
-      <w:proofErr w:type="spellEnd"/>
-      <w:r>
-        <w:rPr>
-          <w:lang w:val="en-GB"/>
-        </w:rPr>
-        <w:t xml:space="preserve"> Trieste, </w:t>
-      </w:r>
-      <w:proofErr w:type="spellStart"/>
-      <w:r>
-        <w:rPr>
-          <w:lang w:val="en-GB"/>
-        </w:rPr>
-        <w:t>Basovizza</w:t>
-      </w:r>
-      <w:proofErr w:type="spellEnd"/>
-      <w:r>
-        <w:rPr>
-          <w:lang w:val="en-GB"/>
-        </w:rPr>
-        <w:t xml:space="preserve">, </w:t>
-      </w:r>
-      <w:r>
-        <w:rPr>
-          <w:lang w:val="en-GB"/>
-        </w:rPr>
-        <w:t>Italy</w:t>
-      </w:r>
-      <w:r>
-        <w:rPr>
-          <w:lang w:val="en-GB"/>
-        </w:rPr>
         <w:t xml:space="preserve"> </w:t>
-      </w:r>
-      <w:r>
-        <w:rPr>
-          <w:lang w:val="en-GB"/>
-        </w:rPr>
-        <w:br/>
       </w:r>
       <w:r>
         <w:rPr>
           <w:vertAlign w:val="superscript"/>
           <w:lang w:val="en-GB"/>
         </w:rPr>
+        <w:br w:type="textWrapping" w:clear="all"/>
         <w:t>2</w:t>
       </w:r>
       <w:r>
         <w:rPr>
           <w:lang w:val="en-GB"/>
         </w:rPr>
-        <w:t>Oak Ridge National Laboratory, Oak Ridge, TN, USA</w:t>
-      </w:r>
+        <w:t xml:space="preserve">Elettra </w:t>
+      </w:r>
+      <w:proofErr w:type="spellStart"/>
       <w:r>
         <w:rPr>
           <w:lang w:val="en-GB"/>
         </w:rPr>
-        <w:br w:type="textWrapping" w:clear="all"/>
+        <w:t>Sincrotrone</w:t>
+      </w:r>
+      <w:proofErr w:type="spellEnd"/>
+      <w:r>
+        <w:rPr>
+          <w:lang w:val="en-GB"/>
+        </w:rPr>
+        <w:t xml:space="preserve"> Trieste, </w:t>
+      </w:r>
+      <w:proofErr w:type="spellStart"/>
+      <w:r>
+        <w:rPr>
+          <w:lang w:val="en-GB"/>
+        </w:rPr>
+        <w:t>Basovizza</w:t>
+      </w:r>
+      <w:proofErr w:type="spellEnd"/>
+      <w:r>
+        <w:rPr>
+          <w:lang w:val="en-GB"/>
+        </w:rPr>
+        <w:t xml:space="preserve">, </w:t>
+      </w:r>
+      <w:r>
+        <w:rPr>
+          <w:lang w:val="en-GB"/>
+        </w:rPr>
+        <w:t>Italy</w:t>
+      </w:r>
+      <w:r>
+        <w:rPr>
+          <w:lang w:val="en-GB"/>
+        </w:rPr>
+        <w:t xml:space="preserve"> </w:t>
+      </w:r>
+      <w:r>
+        <w:rPr>
+          <w:lang w:val="en-GB"/>
+        </w:rPr>
+        <w:br/>
       </w:r>
       <w:r>
         <w:rPr>
@@ -203,63 +210,7 @@
         <w:rPr>
           <w:lang w:val="en-GB"/>
         </w:rPr>
-        <w:t xml:space="preserve">PSI </w:t>
-      </w:r>
-      <w:proofErr w:type="spellStart"/>
-      <w:r>
-        <w:rPr>
-          <w:lang w:val="en-GB"/>
-        </w:rPr>
-        <w:t>Center</w:t>
-      </w:r>
-      <w:proofErr w:type="spellEnd"/>
-      <w:r>
-        <w:rPr>
-          <w:lang w:val="en-GB"/>
-        </w:rPr>
-        <w:t xml:space="preserve"> for Accelerator</w:t>
-      </w:r>
-      <w:r>
-        <w:rPr>
-          <w:lang w:val="en-GB"/>
-        </w:rPr>
-        <w:t xml:space="preserve"> </w:t>
-      </w:r>
-      <w:r>
-        <w:rPr>
-          <w:lang w:val="en-GB"/>
-        </w:rPr>
-        <w:t>Science</w:t>
-      </w:r>
-      <w:r>
-        <w:rPr>
-          <w:lang w:val="en-GB"/>
-        </w:rPr>
-        <w:t xml:space="preserve"> and Engineering</w:t>
-      </w:r>
-      <w:r>
-        <w:rPr>
-          <w:lang w:val="en-GB"/>
-        </w:rPr>
-        <w:t xml:space="preserve">, </w:t>
-      </w:r>
-      <w:r>
-        <w:rPr>
-          <w:lang w:val="en-GB"/>
-        </w:rPr>
-        <w:t>Villigen</w:t>
-      </w:r>
-      <w:r>
-        <w:rPr>
-          <w:lang w:val="en-GB"/>
-        </w:rPr>
-        <w:t xml:space="preserve">, </w:t>
-      </w:r>
-      <w:r>
-        <w:rPr>
-          <w:lang w:val="en-GB"/>
-        </w:rPr>
-        <w:t>Switzerland</w:t>
+        <w:t>Oak Ridge National Laboratory, Oak Ridge, TN, USA</w:t>
       </w:r>
       <w:r>
         <w:rPr>
@@ -309,7 +260,7 @@
         <w:t>, Darmstadt, Germany</w:t>
       </w:r>
     </w:p>
-    <w:bookmarkEnd w:id="1"/>
+    <w:bookmarkEnd w:id="0"/>
     <w:p>
       <w:pPr>
         <w:pStyle w:val="Caption"/>
@@ -1656,9 +1607,9 @@
           <w:docGrid w:linePitch="360"/>
         </w:sectPr>
       </w:pPr>
-      <w:bookmarkStart w:id="2" w:name="_Hlk181873127"/>
-    </w:p>
-    <w:bookmarkEnd w:id="2"/>
+      <w:bookmarkStart w:id="1" w:name="_Hlk181873127"/>
+    </w:p>
+    <w:bookmarkEnd w:id="1"/>
     <w:p>
       <w:pPr>
         <w:pStyle w:val="JACoWBodyTextIndent"/>
@@ -1899,7 +1850,7 @@
       <w:pPr>
         <w:pStyle w:val="JACoWThird-levelHeading"/>
       </w:pPr>
-      <w:bookmarkStart w:id="3" w:name="_Hlk188885781"/>
+      <w:bookmarkStart w:id="2" w:name="_Hlk188885781"/>
       <w:r>
         <w:rPr>
           <w:rStyle w:val="JACoWBodyTextIndentChar"/>
@@ -1918,7 +1869,7 @@
         </w:rPr>
         <w:t> </w:t>
       </w:r>
-      <w:bookmarkEnd w:id="3"/>
+      <w:bookmarkEnd w:id="2"/>
       <w:r>
         <w:rPr>
           <w:rStyle w:val="JACoWBodyTextIndentChar"/>
@@ -2512,7 +2463,7 @@
           <v:shape id="_x0000_i1025" type="#_x0000_t75" style="width:111.75pt;height:30pt" o:ole="">
             <v:imagedata r:id="rId10" o:title=""/>
           </v:shape>
-          <o:OLEObject Type="Embed" ProgID="Equation.DSMT4" ShapeID="_x0000_i1025" DrawAspect="Content" ObjectID="_1807342037" r:id="rId11"/>
+          <o:OLEObject Type="Embed" ProgID="Equation.DSMT4" ShapeID="_x0000_i1025" DrawAspect="Content" ObjectID="_1807453997" r:id="rId11"/>
         </w:object>
       </w:r>
       <w:r>
@@ -2635,7 +2586,7 @@
       <w:r>
         <w:t xml:space="preserve">across multiple lines. </w:t>
       </w:r>
-      <w:bookmarkStart w:id="4" w:name="_Hlk196385162"/>
+      <w:bookmarkStart w:id="3" w:name="_Hlk196385162"/>
       <w:r>
         <w:t>A hyperlink</w:t>
       </w:r>
@@ -2687,7 +2638,7 @@
       <w:r>
         <w:t>Preferences</w:t>
       </w:r>
-      <w:bookmarkStart w:id="5" w:name="_Hlk188950937"/>
+      <w:bookmarkStart w:id="4" w:name="_Hlk188950937"/>
       <w:r>
         <w:t xml:space="preserve"> </w:t>
       </w:r>
@@ -2700,7 +2651,7 @@
       <w:r>
         <w:t xml:space="preserve"> </w:t>
       </w:r>
-      <w:bookmarkEnd w:id="5"/>
+      <w:bookmarkEnd w:id="4"/>
       <w:r>
         <w:t xml:space="preserve">Settings </w:t>
       </w:r>
@@ -2717,7 +2668,7 @@
         <w:t>Add Links.</w:t>
       </w:r>
     </w:p>
-    <w:bookmarkEnd w:id="4"/>
+    <w:bookmarkEnd w:id="3"/>
     <w:p>
       <w:pPr>
         <w:pStyle w:val="JACoWBodyTextIndent"/>
@@ -3391,19 +3342,19 @@
         </w:rPr>
         <w:t></w:t>
       </w:r>
-      <w:bookmarkStart w:id="6" w:name="_Hlk196383274"/>
-      <w:bookmarkStart w:id="7" w:name="_Hlk196383260"/>
+      <w:bookmarkStart w:id="5" w:name="_Hlk196383274"/>
+      <w:bookmarkStart w:id="6" w:name="_Hlk196383260"/>
       <w:r>
         <w:rPr>
           <w:rFonts w:ascii="Symbol" w:hAnsi="Symbol"/>
         </w:rPr>
         <w:t></w:t>
       </w:r>
+      <w:bookmarkEnd w:id="5"/>
+      <w:r>
+        <w:t xml:space="preserve"> </w:t>
+      </w:r>
       <w:bookmarkEnd w:id="6"/>
-      <w:r>
-        <w:t xml:space="preserve"> </w:t>
-      </w:r>
-      <w:bookmarkEnd w:id="7"/>
       <w:r>
         <w:rPr>
           <w:rStyle w:val="JACoWBodyTextIndentChar"/>
@@ -5510,7 +5461,7 @@
       <w:r>
         <w:t xml:space="preserve">If the author list spans multiple lines, please be sure to break the line in a manner that does not split the author’s initials from the author’s last name. This is easily done by placing unbreakable spaces between the initials and last name. </w:t>
       </w:r>
-      <w:bookmarkStart w:id="8" w:name="_Hlk181873254"/>
+      <w:bookmarkStart w:id="7" w:name="_Hlk181873254"/>
       <w:r>
         <w:t xml:space="preserve">In cases where authors have multiple affiliations, the secondary affiliation </w:t>
       </w:r>
@@ -5544,7 +5495,7 @@
       <w:r>
         <w:t>.</w:t>
       </w:r>
-      <w:bookmarkEnd w:id="8"/>
+      <w:bookmarkEnd w:id="7"/>
       <w:r>
         <w:t xml:space="preserve"> Only the minimal form of the institute name and location </w:t>
       </w:r>
@@ -5654,7 +5605,7 @@
       <w:pPr>
         <w:pStyle w:val="JACoWBodyTextIndent"/>
       </w:pPr>
-      <w:bookmarkStart w:id="9" w:name="_Hlk182225657"/>
+      <w:bookmarkStart w:id="8" w:name="_Hlk182225657"/>
       <w:r>
         <w:t>For manuscripts submitted by large collaborations with p</w:t>
       </w:r>
@@ -5674,7 +5625,7 @@
         <w:t>.</w:t>
       </w:r>
     </w:p>
-    <w:bookmarkEnd w:id="9"/>
+    <w:bookmarkEnd w:id="8"/>
     <w:p>
       <w:pPr>
         <w:pStyle w:val="JACoWBodyTextIndent"/>
@@ -6271,7 +6222,7 @@
           <w:lang w:val="en-GB"/>
         </w:rPr>
       </w:pPr>
-      <w:bookmarkStart w:id="10" w:name="_Hlk182224520"/>
+      <w:bookmarkStart w:id="9" w:name="_Hlk182224520"/>
       <w:r>
         <w:rPr>
           <w:lang w:val="en-GB"/>
@@ -6291,7 +6242,7 @@
         </w:rPr>
         <w:t>, CERN, Geneva, Switzerland</w:t>
       </w:r>
-      <w:bookmarkEnd w:id="10"/>
+      <w:bookmarkEnd w:id="9"/>
       <w:r>
         <w:rPr>
           <w:vertAlign w:val="superscript"/>
@@ -6299,7 +6250,7 @@
         </w:rPr>
         <w:br w:type="textWrapping" w:clear="all"/>
       </w:r>
-      <w:bookmarkStart w:id="11" w:name="_Hlk182225999"/>
+      <w:bookmarkStart w:id="10" w:name="_Hlk182225999"/>
       <w:r>
         <w:rPr>
           <w:lang w:val="en-GB"/>
@@ -6396,7 +6347,7 @@
         </w:rPr>
         <w:br w:type="textWrapping" w:clear="all"/>
       </w:r>
-      <w:bookmarkEnd w:id="11"/>
+      <w:bookmarkEnd w:id="10"/>
       <w:r>
         <w:rPr>
           <w:vertAlign w:val="superscript"/>
@@ -6668,11 +6619,11 @@
       <w:pPr>
         <w:pStyle w:val="JACoWSubsectionHeading"/>
       </w:pPr>
-      <w:bookmarkStart w:id="12" w:name="_Hlk182231580"/>
+      <w:bookmarkStart w:id="11" w:name="_Hlk182231580"/>
       <w:r>
         <w:t>Formatting of Authors and Paper Titles</w:t>
       </w:r>
-      <w:bookmarkEnd w:id="12"/>
+      <w:bookmarkEnd w:id="11"/>
     </w:p>
     <w:p>
       <w:pPr>
@@ -7311,7 +7262,7 @@
         <w:pStyle w:val="JACoWBodyTextIndent"/>
         <w:spacing w:before="120"/>
       </w:pPr>
-      <w:bookmarkStart w:id="13" w:name="_Hlk182231854"/>
+      <w:bookmarkStart w:id="12" w:name="_Hlk182231854"/>
       <w:r>
         <w:rPr>
           <w:rStyle w:val="JACoWThird-levelHeadingChar"/>
@@ -7333,7 +7284,7 @@
         </w:rPr>
         <w:t> </w:t>
       </w:r>
-      <w:bookmarkEnd w:id="13"/>
+      <w:bookmarkEnd w:id="12"/>
       <w:r>
         <w:t>The</w:t>
       </w:r>
@@ -7535,7 +7486,7 @@
         <w:pStyle w:val="JACoWBodyTextIndent"/>
         <w:spacing w:before="120"/>
       </w:pPr>
-      <w:bookmarkStart w:id="14" w:name="_Hlk182231964"/>
+      <w:bookmarkStart w:id="13" w:name="_Hlk182231964"/>
       <w:r>
         <w:rPr>
           <w:b/>
@@ -7562,7 +7513,7 @@
         </w:rPr>
         <w:t> </w:t>
       </w:r>
-      <w:bookmarkEnd w:id="14"/>
+      <w:bookmarkEnd w:id="13"/>
       <w:r>
         <w:t xml:space="preserve">The </w:t>
       </w:r>
@@ -7892,7 +7843,7 @@
       <w:pPr>
         <w:pStyle w:val="JACoWBodyTextIndent"/>
       </w:pPr>
-      <w:bookmarkStart w:id="15" w:name="_Hlk182232075"/>
+      <w:bookmarkStart w:id="14" w:name="_Hlk182232075"/>
       <w:r>
         <w:t>Use of the said style for references ensures</w:t>
       </w:r>
@@ -7959,7 +7910,7 @@
       <w:r>
         <w:t xml:space="preserve">]; </w:t>
       </w:r>
-      <w:bookmarkEnd w:id="15"/>
+      <w:bookmarkEnd w:id="14"/>
       <w:r>
         <w:t>the wording “this conference” may be appended.</w:t>
       </w:r>
@@ -8360,7 +8311,7 @@
             <w:pPr>
               <w:pStyle w:val="JACoWTableColumnHeading"/>
             </w:pPr>
-            <w:bookmarkStart w:id="16" w:name="_Hlk182229230"/>
+            <w:bookmarkStart w:id="15" w:name="_Hlk182229230"/>
             <w:r>
               <w:t>Font</w:t>
             </w:r>
@@ -8917,7 +8868,7 @@
         </w:tc>
       </w:tr>
     </w:tbl>
-    <w:bookmarkEnd w:id="16"/>
+    <w:bookmarkEnd w:id="15"/>
     <w:p>
       <w:pPr>
         <w:pStyle w:val="JACoWSubsectionHeading"/>
@@ -10510,7 +10461,7 @@
       <w:r>
         <w:t>[</w:t>
       </w:r>
-      <w:bookmarkStart w:id="17" w:name="_Hlk188444433"/>
+      <w:bookmarkStart w:id="16" w:name="_Hlk188444433"/>
       <w:r>
         <w:t>9</w:t>
       </w:r>
@@ -10601,7 +10552,7 @@
         </w:r>
       </w:hyperlink>
     </w:p>
-    <w:bookmarkEnd w:id="17"/>
+    <w:bookmarkEnd w:id="16"/>
     <w:p>
       <w:pPr>
         <w:pStyle w:val="JACoWReference1-9when10Refs"/>
@@ -11044,7 +10995,7 @@
       <w:pPr>
         <w:pStyle w:val="JACoWReference10onwards"/>
       </w:pPr>
-      <w:bookmarkStart w:id="18" w:name="_Hlk196727890"/>
+      <w:bookmarkStart w:id="17" w:name="_Hlk196727890"/>
       <w:r>
         <w:t>[</w:t>
       </w:r>
@@ -11069,7 +11020,7 @@
       <w:r>
         <w:t xml:space="preserve">, </w:t>
       </w:r>
-      <w:bookmarkEnd w:id="18"/>
+      <w:bookmarkEnd w:id="17"/>
       <w:r>
         <w:t>“List of Title Word Abbreviations”,</w:t>
       </w:r>
@@ -11149,7 +11100,7 @@
       <w:pPr>
         <w:pStyle w:val="JACoWSubsectionHeading"/>
       </w:pPr>
-      <w:bookmarkStart w:id="19" w:name="_Hlk188952833"/>
+      <w:bookmarkStart w:id="18" w:name="_Hlk188952833"/>
       <w:r>
         <w:rPr>
           <w:rStyle w:val="JACoWReferenceurldoiChar"/>
@@ -11187,7 +11138,7 @@
         <w:t>ication</w:t>
       </w:r>
     </w:p>
-    <w:bookmarkEnd w:id="19"/>
+    <w:bookmarkEnd w:id="18"/>
     <w:p>
       <w:pPr>
         <w:pStyle w:val="JACoWReference10onwards"/>
@@ -11201,11 +11152,11 @@
       <w:r>
         <w:t>]</w:t>
       </w:r>
-      <w:bookmarkStart w:id="20" w:name="_Hlk188516642"/>
-      <w:r>
-        <w:tab/>
-      </w:r>
-      <w:bookmarkEnd w:id="20"/>
+      <w:bookmarkStart w:id="19" w:name="_Hlk188516642"/>
+      <w:r>
+        <w:tab/>
+      </w:r>
+      <w:bookmarkEnd w:id="19"/>
       <w:r>
         <w:t>J</w:t>
       </w:r>
@@ -11300,9 +11251,9 @@
       <w:pPr>
         <w:pStyle w:val="JACoWReference10onwards"/>
       </w:pPr>
-      <w:bookmarkStart w:id="21" w:name="_Hlk196727820"/>
-      <w:bookmarkStart w:id="22" w:name="_Hlk188517060"/>
-      <w:bookmarkStart w:id="23" w:name="_Hlk188517102"/>
+      <w:bookmarkStart w:id="20" w:name="_Hlk196727820"/>
+      <w:bookmarkStart w:id="21" w:name="_Hlk188517060"/>
+      <w:bookmarkStart w:id="22" w:name="_Hlk188517102"/>
       <w:r>
         <w:t>[1</w:t>
       </w:r>
@@ -11312,39 +11263,39 @@
       <w:r>
         <w:t>]</w:t>
       </w:r>
-      <w:bookmarkStart w:id="24" w:name="_Hlk188516576"/>
-      <w:r>
-        <w:tab/>
+      <w:bookmarkStart w:id="23" w:name="_Hlk188516576"/>
+      <w:r>
+        <w:tab/>
+      </w:r>
+      <w:bookmarkEnd w:id="23"/>
+      <w:r>
+        <w:t>G.</w:t>
+      </w:r>
+      <w:r>
+        <w:t> </w:t>
+      </w:r>
+      <w:r>
+        <w:t>D. </w:t>
+      </w:r>
+      <w:r>
+        <w:t>Read</w:t>
+      </w:r>
+      <w:bookmarkEnd w:id="20"/>
+      <w:r>
+        <w:t xml:space="preserve">, </w:t>
+      </w:r>
+      <w:bookmarkStart w:id="24" w:name="_Hlk188444978"/>
+      <w:r>
+        <w:t>“</w:t>
+      </w:r>
+      <w:r>
+        <w:t>Title of paper</w:t>
       </w:r>
       <w:bookmarkEnd w:id="24"/>
       <w:r>
-        <w:t>G.</w:t>
-      </w:r>
-      <w:r>
-        <w:t> </w:t>
-      </w:r>
-      <w:r>
-        <w:t>D. </w:t>
-      </w:r>
-      <w:r>
-        <w:t>Read</w:t>
+        <w:t>”, submitted for publication.</w:t>
       </w:r>
       <w:bookmarkEnd w:id="21"/>
-      <w:r>
-        <w:t xml:space="preserve">, </w:t>
-      </w:r>
-      <w:bookmarkStart w:id="25" w:name="_Hlk188444978"/>
-      <w:r>
-        <w:t>“</w:t>
-      </w:r>
-      <w:r>
-        <w:t>Title of paper</w:t>
-      </w:r>
-      <w:bookmarkEnd w:id="25"/>
-      <w:r>
-        <w:t>”, submitted for publication.</w:t>
-      </w:r>
-      <w:bookmarkEnd w:id="22"/>
     </w:p>
     <w:p>
       <w:pPr>
@@ -11355,8 +11306,8 @@
           <w:lang w:val="en-US"/>
         </w:rPr>
       </w:pPr>
-      <w:bookmarkStart w:id="26" w:name="_Hlk188444805"/>
-      <w:bookmarkEnd w:id="23"/>
+      <w:bookmarkStart w:id="25" w:name="_Hlk188444805"/>
+      <w:bookmarkEnd w:id="22"/>
       <w:proofErr w:type="spellStart"/>
       <w:r>
         <w:rPr>
@@ -11537,7 +11488,7 @@
           <w:lang w:val="fr-CH"/>
         </w:rPr>
       </w:pPr>
-      <w:bookmarkStart w:id="27" w:name="_Hlk196727323"/>
+      <w:bookmarkStart w:id="26" w:name="_Hlk196727323"/>
       <w:r>
         <w:rPr>
           <w:rStyle w:val="JACoWReference10onwardsChar"/>
@@ -11576,7 +11527,7 @@
         <w:t>https://www.jacow.org</w:t>
       </w:r>
     </w:p>
-    <w:bookmarkEnd w:id="27"/>
+    <w:bookmarkEnd w:id="26"/>
     <w:p>
       <w:pPr>
         <w:spacing w:before="0" w:after="60"/>
@@ -11673,7 +11624,7 @@
           <w:lang w:val="fr-CH"/>
         </w:rPr>
       </w:pPr>
-      <w:bookmarkStart w:id="28" w:name="_Hlk196727284"/>
+      <w:bookmarkStart w:id="27" w:name="_Hlk196727284"/>
       <w:r>
         <w:rPr>
           <w:rStyle w:val="JACoWReference10onwardsChar"/>
@@ -11718,8 +11669,8 @@
         <w:t>https://www.tango-controls.org</w:t>
       </w:r>
     </w:p>
-    <w:bookmarkEnd w:id="26"/>
-    <w:bookmarkEnd w:id="28"/>
+    <w:bookmarkEnd w:id="25"/>
+    <w:bookmarkEnd w:id="27"/>
     <w:p>
       <w:pPr>
         <w:pStyle w:val="JACoWSubsectionHeading"/>
@@ -12055,7 +12006,7 @@
         </w:rPr>
         <w:t>]</w:t>
       </w:r>
-      <w:bookmarkStart w:id="29" w:name="_Hlk188516503"/>
+      <w:bookmarkStart w:id="28" w:name="_Hlk188516503"/>
       <w:r>
         <w:rPr>
           <w:rStyle w:val="JACoWReference10onwardsChar"/>
@@ -12064,7 +12015,7 @@
         </w:rPr>
         <w:tab/>
       </w:r>
-      <w:bookmarkEnd w:id="29"/>
+      <w:bookmarkEnd w:id="28"/>
       <w:r>
         <w:rPr>
           <w:rStyle w:val="JACoWReference10onwardsChar"/>
@@ -12497,7 +12448,7 @@
       <w:pPr>
         <w:pStyle w:val="JACoWSubsectionHeading"/>
       </w:pPr>
-      <w:bookmarkStart w:id="30" w:name="_Hlk188515322"/>
+      <w:bookmarkStart w:id="29" w:name="_Hlk188515322"/>
       <w:r>
         <w:t>M</w:t>
       </w:r>
@@ -12505,7 +12456,7 @@
         <w:t>anual</w:t>
       </w:r>
     </w:p>
-    <w:bookmarkEnd w:id="30"/>
+    <w:bookmarkEnd w:id="29"/>
     <w:p>
       <w:pPr>
         <w:pStyle w:val="JACoWReference10onwards"/>
@@ -14149,7 +14100,7 @@
           <w:lang w:val="en-US"/>
         </w:rPr>
       </w:pPr>
-      <w:bookmarkStart w:id="31" w:name="_Hlk188955529"/>
+      <w:bookmarkStart w:id="30" w:name="_Hlk188955529"/>
       <w:proofErr w:type="spellStart"/>
       <w:r>
         <w:rPr>
@@ -14259,7 +14210,7 @@
         </w:rPr>
         <w:t>Artificial Intelligence</w:t>
       </w:r>
-      <w:bookmarkEnd w:id="31"/>
+      <w:bookmarkEnd w:id="30"/>
     </w:p>
     <w:p>
       <w:pPr>
@@ -16233,7 +16184,7 @@
           <w:lang w:val="fr-CH"/>
         </w:rPr>
       </w:pPr>
-      <w:bookmarkStart w:id="32" w:name="_Hlk188522483"/>
+      <w:bookmarkStart w:id="31" w:name="_Hlk188522483"/>
       <w:r>
         <w:rPr>
           <w:rFonts w:eastAsia="Calibri"/>
@@ -16288,7 +16239,7 @@
         <w:t>IEEE Transactions on Communications</w:t>
       </w:r>
     </w:p>
-    <w:bookmarkEnd w:id="32"/>
+    <w:bookmarkEnd w:id="31"/>
     <w:p>
       <w:pPr>
         <w:rPr>
@@ -16561,7 +16512,7 @@
           <w:lang w:val="en-US"/>
         </w:rPr>
       </w:pPr>
-      <w:bookmarkStart w:id="33" w:name="_Hlk188522586"/>
+      <w:bookmarkStart w:id="32" w:name="_Hlk188522586"/>
       <w:r>
         <w:rPr>
           <w:rFonts w:eastAsia="Calibri"/>
@@ -16670,7 +16621,7 @@
         <w:t>IEEE Transactions on Nuclear Science</w:t>
       </w:r>
     </w:p>
-    <w:bookmarkEnd w:id="33"/>
+    <w:bookmarkEnd w:id="32"/>
     <w:p>
       <w:pPr>
         <w:rPr>
@@ -17737,7 +17688,7 @@
         </w:rPr>
         <w:tab/>
       </w:r>
-      <w:bookmarkStart w:id="34" w:name="_Hlk188518702"/>
+      <w:bookmarkStart w:id="33" w:name="_Hlk188518702"/>
       <w:r>
         <w:rPr>
           <w:rFonts w:eastAsia="Calibri"/>
@@ -17747,7 +17698,7 @@
         <w:tab/>
         <w:t xml:space="preserve">Journal of Computational </w:t>
       </w:r>
-      <w:bookmarkEnd w:id="34"/>
+      <w:bookmarkEnd w:id="33"/>
       <w:r>
         <w:rPr>
           <w:rFonts w:eastAsia="Calibri"/>

</xml_diff>

<commit_message>
Word style guide v 20260208
</commit_message>
<xml_diff>
--- a/MSWord/JACoW_MSWord_Style_Guide.docx
+++ b/MSWord/JACoW_MSWord_Style_Guide.docx
@@ -1712,7 +1712,7 @@
         </w:rPr>
         <w:lastRenderedPageBreak/>
         <w:drawing>
-          <wp:inline distT="0" distB="0" distL="0" distR="0" wp14:anchorId="2689F669" wp14:editId="68B03091">
+          <wp:inline distT="0" distB="0" distL="0" distR="0" wp14:anchorId="2689F669" wp14:editId="50BF6BE9">
             <wp:extent cx="6100051" cy="2608970"/>
             <wp:effectExtent l="0" t="0" r="0" b="1270"/>
             <wp:docPr id="2048806647" name="Picture 1" descr="A group of people standing on steps&#10;&#10;AI-generated content may be incorrect."/>
@@ -1862,7 +1862,31 @@
         <w:rPr>
           <w:rStyle w:val="JACoWThirdLevelHeadingChar"/>
         </w:rPr>
-        <w:t xml:space="preserve"> and listed in 12 pt upper- and lowercase letters. The name of the submitting or primary author should be first, followed by the coauthors, alphabetically. </w:t>
+        <w:t xml:space="preserve"> and listed in 12 pt upper- and lowercase letters. The name</w:t>
+      </w:r>
+      <w:r>
+        <w:rPr>
+          <w:rStyle w:val="JACoWThirdLevelHeadingChar"/>
+        </w:rPr>
+        <w:t>(s)</w:t>
+      </w:r>
+      <w:r>
+        <w:rPr>
+          <w:rStyle w:val="JACoWThirdLevelHeadingChar"/>
+        </w:rPr>
+        <w:t xml:space="preserve"> of the primary author</w:t>
+      </w:r>
+      <w:r>
+        <w:rPr>
+          <w:rStyle w:val="JACoWThirdLevelHeadingChar"/>
+        </w:rPr>
+        <w:t>(s)</w:t>
+      </w:r>
+      <w:r>
+        <w:rPr>
+          <w:rStyle w:val="JACoWThirdLevelHeadingChar"/>
+        </w:rPr>
+        <w:t xml:space="preserve"> should be first, followed by the coauthors, alphabetically. </w:t>
       </w:r>
       <w:r>
         <w:rPr>

</xml_diff>